<commit_message>
Add error and success dialog boxes (3 dialog types) to IO docx
Co-Authored-By: Claude Opus 4.8 <noreply@anthropic.com>
Claude-Session: https://claude.ai/code/session_016gShTjrczYVq9PahH9u6Mo
</commit_message>
<xml_diff>
--- a/cinema-management-system-analysis/Cinema_IO_Design.docx
+++ b/cinema-management-system-analysis/Cinema_IO_Design.docx
@@ -318,6 +318,12 @@
         <w:t xml:space="preserve">Dialog Boxes</w:t>
       </w:r>
     </w:p>
+    <w:p>
+      <w:pPr/>
+      <w:r>
+        <w:t xml:space="preserve">The system uses three types of dialog box: confirmation (Yes/No), error/alert (OK) and information/success (OK).</w:t>
+      </w:r>
+    </w:p>
     <w:tbl>
       <w:tblPr>
         <w:tblW w:w="7000" w:type="dxa"/>
@@ -418,6 +424,108 @@
       </w:tr>
     </w:tbl>
     <w:p>
+      <w:pPr/>
+    </w:p>
+    <w:tbl>
+      <w:tblPr>
+        <w:tblW w:w="7000" w:type="dxa"/>
+        <w:tblBorders>
+          <w:top w:val="single" w:sz="6" w:space="0" w:color="000000"/>
+          <w:left w:val="single" w:sz="6" w:space="0" w:color="000000"/>
+          <w:bottom w:val="single" w:sz="6" w:space="0" w:color="000000"/>
+          <w:right w:val="single" w:sz="6" w:space="0" w:color="000000"/>
+          <w:insideH w:val="single" w:sz="6" w:space="0" w:color="000000"/>
+          <w:insideV w:val="single" w:sz="6" w:space="0" w:color="000000"/>
+        </w:tblBorders>
+      </w:tblPr>
+      <w:tr>
+        <w:tc>
+          <w:tcPr>
+            <w:tcW w:w="7000" w:type="dxa"/>
+          </w:tcPr>
+          <w:p>
+            <w:pPr>
+              <w:jc w:val="center"/>
+            </w:pPr>
+            <w:r>
+              <w:rPr>
+                <w:b/>
+              </w:rPr>
+              <w:t xml:space="preserve">Error</w:t>
+            </w:r>
+          </w:p>
+          <w:p>
+            <w:pPr/>
+            <w:r>
+              <w:t xml:space="preserve">Seat already booked - please choose another seat.</w:t>
+            </w:r>
+          </w:p>
+          <w:p>
+            <w:pPr>
+              <w:jc w:val="center"/>
+            </w:pPr>
+            <w:r>
+              <w:rPr>
+                <w:b/>
+              </w:rPr>
+              <w:t xml:space="preserve">[ OK ]</w:t>
+            </w:r>
+          </w:p>
+        </w:tc>
+      </w:tr>
+    </w:tbl>
+    <w:p>
+      <w:pPr/>
+    </w:p>
+    <w:tbl>
+      <w:tblPr>
+        <w:tblW w:w="7000" w:type="dxa"/>
+        <w:tblBorders>
+          <w:top w:val="single" w:sz="6" w:space="0" w:color="000000"/>
+          <w:left w:val="single" w:sz="6" w:space="0" w:color="000000"/>
+          <w:bottom w:val="single" w:sz="6" w:space="0" w:color="000000"/>
+          <w:right w:val="single" w:sz="6" w:space="0" w:color="000000"/>
+          <w:insideH w:val="single" w:sz="6" w:space="0" w:color="000000"/>
+          <w:insideV w:val="single" w:sz="6" w:space="0" w:color="000000"/>
+        </w:tblBorders>
+      </w:tblPr>
+      <w:tr>
+        <w:tc>
+          <w:tcPr>
+            <w:tcW w:w="7000" w:type="dxa"/>
+          </w:tcPr>
+          <w:p>
+            <w:pPr>
+              <w:jc w:val="center"/>
+            </w:pPr>
+            <w:r>
+              <w:rPr>
+                <w:b/>
+              </w:rPr>
+              <w:t xml:space="preserve">Success</w:t>
+            </w:r>
+          </w:p>
+          <w:p>
+            <w:pPr/>
+            <w:r>
+              <w:t xml:space="preserve">Ticket booked successfully. Seat B2, B3 - Total 40.00.</w:t>
+            </w:r>
+          </w:p>
+          <w:p>
+            <w:pPr>
+              <w:jc w:val="center"/>
+            </w:pPr>
+            <w:r>
+              <w:rPr>
+                <w:b/>
+              </w:rPr>
+              <w:t xml:space="preserve">[ OK ]</w:t>
+            </w:r>
+          </w:p>
+        </w:tc>
+      </w:tr>
+    </w:tbl>
+    <w:p>
       <w:r>
         <w:br w:type="page"/>
       </w:r>

</xml_diff>